<commit_message>
feat: regresión cúbica local para generalizar el pico a cualquier canción
- pico_local: misma cúbica por mínimos cuadrados (eliminación gaussiana) en ±6 semanas
  alrededor del pico medido; pico válido en las 3 canciones, con sensibilidad w=4/6/8
- informe (3.5, 3.7 y conclusiones) y diapositivas 11 y 13 actualizados; PDF exportados
- frases exageradas corregidas en la presentación; guía de defensa al día

Co-Authored-By: Claude Opus 5.5 <noreply@anthropic.com>
</commit_message>
<xml_diff>
--- a/ENTREGABLES/Informe_Proyecto_Metodos_Numericos_Rosa_Pastel.docx
+++ b/ENTREGABLES/Informe_Proyecto_Metodos_Numericos_Rosa_Pastel.docx
@@ -380,7 +380,7 @@
             </w:tabs>
           </w:pPr>
           <w:r>
-            <w:fldChar w:fldCharType="begin"/>
+            <w:fldChar w:fldCharType="begin" w:dirty="true"/>
           </w:r>
           <w:r>
             <w:instrText xml:space="preserve">TOC \h \o "1-3"</w:instrText>
@@ -31973,13 +31973,7 @@
         <w:spacing w:after="80" w:before="200"/>
       </w:pPr>
       <w:r>
-        <w:rPr>
-          <w:i/>
-          <w:iCs/>
-          <w:sz w:val="20"/>
-          <w:szCs w:val="20"/>
-        </w:rPr>
-        <w:t xml:space="preserve">Tabla 9. Pico de demanda según el modelo y según los datos.</w:t>
+        <w:t>Tabla 9. Pico global y pico medido; diagnóstico considerando también el ajuste local.</w:t>
       </w:r>
     </w:p>
     <w:tbl>
@@ -32120,7 +32114,7 @@
                 <w:sz w:val="20"/>
                 <w:szCs w:val="20"/>
               </w:rPr>
-              <w:t xml:space="preserve">Pico del modelo</w:t>
+              <w:t>Pico global</w:t>
             </w:r>
           </w:p>
         </w:tc>
@@ -32348,7 +32342,7 @@
                 <w:sz w:val="20"/>
                 <w:szCs w:val="20"/>
               </w:rPr>
-              <w:t xml:space="preserve">aplica</w:t>
+              <w:t>global y local</w:t>
             </w:r>
           </w:p>
         </w:tc>
@@ -32508,7 +32502,7 @@
                 <w:sz w:val="20"/>
                 <w:szCs w:val="20"/>
               </w:rPr>
-              <w:t xml:space="preserve">no aplica</w:t>
+              <w:t>solo local</w:t>
             </w:r>
           </w:p>
         </w:tc>
@@ -32668,7 +32662,7 @@
                 <w:sz w:val="20"/>
                 <w:szCs w:val="20"/>
               </w:rPr>
-              <w:t xml:space="preserve">no aplica</w:t>
+              <w:t>solo local</w:t>
             </w:r>
           </w:p>
         </w:tc>
@@ -33786,7 +33780,7 @@
           <w:b/>
           <w:bCs/>
         </w:rPr>
-        <w:t xml:space="preserve">El pico solo se detecta en «Rosa Pastel».</w:t>
+        <w:t>Con el ajuste global, el pico solo se detecta en «Rosa Pastel».</w:t>
       </w:r>
       <w:r>
         <w:t xml:space="preserve"> En los estrenos, las reproducciones semanales alcanzan su máximo en las primeras semanas (semana 5 con 26,140 M y semana 6 con 9,860 M, respectivamente) y luego decaen durante meses. La cúbica ajusta ese largo decaimiento con </w:t>
@@ -33963,7 +33957,900 @@
         <w:jc w:val="both"/>
       </w:pPr>
       <w:r>
-        <w:t xml:space="preserve">En consecuencia, la regresión cúbica es adecuada para describir fenómenos de resurgimiento gradual, con un crecimiento y una estabilización suaves, pero no para estrenos cuyo máximo se produce al comienzo de la serie. Para estos últimos, el pico debe tomarse directamente de los datos o recurrir a otro tipo de modelo. La Figura 4 compara las tres series.</w:t>
+        <w:t>La dificultad corresponde al ajuste sobre todo el período. La misma regresión cúbica puede aplicarse en una ventana alrededor del pico medido, como se explica a continuación. La Figura 4 compara los ajustes global y local en las tres series.</w:t>
+      </w:r>
+    </w:p>
+    <w:p>
+      <w:pPr>
+        <w:pStyle w:val="Heading3"/>
+      </w:pPr>
+      <w:r>
+        <w:t>3.5.1. Regresión cúbica local</w:t>
+      </w:r>
+    </w:p>
+    <w:p>
+      <w:pPr>
+        <w:ind w:firstLine="720"/>
+        <w:jc w:val="both"/>
+      </w:pPr>
+      <w:r>
+        <w:t>La derivada S′(t) de una cúbica es una parábola: si a &lt; 0, tiene una sola joroba simétrica. En «Rosa Pastel», el pico medido está hacia la mitad del período (semana 26 de 47), por lo que esa forma representa la tendencia. En los estrenos, el pico está en la semana 5 o 6 y después siguen muchas semanas de caída lenta. Mínimos cuadrados asigna el mismo peso a todas las semanas: la cola larga lleva al ajuste global a abrir hacia arriba (a &gt; 0), y t = −b/(3a) resulta un mínimo del ritmo.</w:t>
+      </w:r>
+    </w:p>
+    <w:p>
+      <w:pPr>
+        <w:ind w:firstLine="720"/>
+        <w:jc w:val="both"/>
+      </w:pPr>
+      <w:r>
+        <w:t>Para generalizar la detección se ajusta la misma cúbica del acumulado S(t), con las mismas ecuaciones normales y eliminación gaussiana, solo en [m−6, m+6], recortada a [0, n−1]. La semana m es la de mayor cantidad de streams semanales, equivalente al máximo de las diferencias hacia atrás del acumulado. La ventana de ±6 semanas abarca aproximadamente un trimestre centrado en ese pico. Se conserva la regla: t = −b/(3a) es un pico válido si a &lt; 0 y cae dentro de la ventana; el ritmo se obtiene evaluando S′(t).</w:t>
+      </w:r>
+    </w:p>
+    <w:p>
+      <w:pPr>
+        <w:ind w:firstLine="720"/>
+        <w:jc w:val="both"/>
+      </w:pPr>
+      <w:r>
+        <w:t>Con esta ventana, los tres casos dan un pico válido: «Rosa Pastel», 28,58 semanas y 3,78 M/semana; «Ella Baila Sola», 3,78 semanas y 23,11 M/semana; «Tití Me Preguntó», 6,41 semanas y 9,58 M/semana. La Tabla 11 compara los resultados y la sensibilidad al ancho elegido. Los cálculos globales de Rosa Pastel, sus raíces y el dimensionamiento se mantienen sin cambios.</w:t>
+      </w:r>
+    </w:p>
+    <w:p>
+      <w:pPr>
+        <w:pStyle w:val="Caption"/>
+        <w:keepNext/>
+        <w:spacing w:after="80" w:before="200"/>
+      </w:pPr>
+      <w:r>
+        <w:rPr>
+          <w:i/>
+          <w:iCs/>
+          <w:sz w:val="20"/>
+          <w:szCs w:val="20"/>
+        </w:rPr>
+        <w:t>Tabla 11. Picos en semanas desde t = 0 y sensibilidad de la regresión cúbica local.</w:t>
+      </w:r>
+    </w:p>
+    <w:tbl>
+      <w:tblPr>
+        <w:tblW w:type="dxa" w:w="7423"/>
+        <w:jc w:val="center"/>
+        <w:tblBorders>
+          <w:top w:val="single" w:color="auto" w:sz="4"/>
+          <w:left w:val="single" w:color="auto" w:sz="4"/>
+          <w:bottom w:val="single" w:color="auto" w:sz="4"/>
+          <w:right w:val="single" w:color="auto" w:sz="4"/>
+          <w:insideH w:val="single" w:color="auto" w:sz="4"/>
+          <w:insideV w:val="single" w:color="auto" w:sz="4"/>
+        </w:tblBorders>
+        <w:tblLayout w:type="fixed"/>
+      </w:tblPr>
+      <w:tblGrid>
+        <w:gridCol w:w="1531"/>
+        <w:gridCol w:w="850"/>
+        <w:gridCol w:w="1077"/>
+        <w:gridCol w:w="1020"/>
+        <w:gridCol w:w="1984"/>
+        <w:gridCol w:w="1474"/>
+      </w:tblGrid>
+      <w:tr>
+        <w:trPr>
+          <w:cantSplit/>
+          <w:tblHeader/>
+          <w:cantSplit/>
+          <w:tblHeader/>
+        </w:trPr>
+        <w:tc>
+          <w:tcPr>
+            <w:tcW w:type="dxa" w:w="1531"/>
+            <w:tcBorders>
+              <w:top w:val="single" w:color="000000" w:sz="4"/>
+              <w:left w:val="single" w:color="000000" w:sz="4"/>
+              <w:bottom w:val="single" w:color="000000" w:sz="4"/>
+              <w:right w:val="single" w:color="000000" w:sz="4"/>
+            </w:tcBorders>
+            <w:shd w:fill="E7E6E6" w:color="auto" w:val="clear"/>
+            <w:tcMar>
+              <w:top w:type="dxa" w:w="30"/>
+              <w:left w:type="dxa" w:w="80"/>
+              <w:bottom w:type="dxa" w:w="30"/>
+              <w:right w:type="dxa" w:w="80"/>
+            </w:tcMar>
+            <w:vAlign w:val="center"/>
+          </w:tcPr>
+          <w:p>
+            <w:pPr>
+              <w:keepNext/>
+              <w:spacing w:after="0" w:line="240" w:lineRule="auto"/>
+              <w:jc w:val="left"/>
+            </w:pPr>
+            <w:r>
+              <w:rPr>
+                <w:b/>
+                <w:bCs/>
+                <w:sz w:val="18"/>
+                <w:szCs w:val="20"/>
+              </w:rPr>
+              <w:t>Canción</w:t>
+            </w:r>
+          </w:p>
+        </w:tc>
+        <w:tc>
+          <w:tcPr>
+            <w:tcW w:type="dxa" w:w="850"/>
+            <w:tcBorders>
+              <w:top w:val="single" w:color="000000" w:sz="4"/>
+              <w:left w:val="single" w:color="000000" w:sz="4"/>
+              <w:bottom w:val="single" w:color="000000" w:sz="4"/>
+              <w:right w:val="single" w:color="000000" w:sz="4"/>
+            </w:tcBorders>
+            <w:shd w:fill="E7E6E6" w:color="auto" w:val="clear"/>
+            <w:tcMar>
+              <w:top w:type="dxa" w:w="30"/>
+              <w:left w:type="dxa" w:w="80"/>
+              <w:bottom w:type="dxa" w:w="30"/>
+              <w:right w:type="dxa" w:w="80"/>
+            </w:tcMar>
+            <w:vAlign w:val="center"/>
+          </w:tcPr>
+          <w:p>
+            <w:pPr>
+              <w:keepNext/>
+              <w:spacing w:after="0" w:line="240" w:lineRule="auto"/>
+              <w:jc w:val="center"/>
+            </w:pPr>
+            <w:r>
+              <w:rPr>
+                <w:b/>
+                <w:bCs/>
+                <w:sz w:val="18"/>
+                <w:szCs w:val="20"/>
+              </w:rPr>
+              <w:t>Pico datos</w:t>
+            </w:r>
+          </w:p>
+        </w:tc>
+        <w:tc>
+          <w:tcPr>
+            <w:tcW w:type="dxa" w:w="1077"/>
+            <w:tcBorders>
+              <w:top w:val="single" w:color="000000" w:sz="4"/>
+              <w:left w:val="single" w:color="000000" w:sz="4"/>
+              <w:bottom w:val="single" w:color="000000" w:sz="4"/>
+              <w:right w:val="single" w:color="000000" w:sz="4"/>
+            </w:tcBorders>
+            <w:shd w:fill="E7E6E6" w:color="auto" w:val="clear"/>
+            <w:tcMar>
+              <w:top w:type="dxa" w:w="30"/>
+              <w:left w:type="dxa" w:w="80"/>
+              <w:bottom w:type="dxa" w:w="30"/>
+              <w:right w:type="dxa" w:w="80"/>
+            </w:tcMar>
+            <w:vAlign w:val="center"/>
+          </w:tcPr>
+          <w:p>
+            <w:pPr>
+              <w:keepNext/>
+              <w:spacing w:after="0" w:line="240" w:lineRule="auto"/>
+              <w:jc w:val="center"/>
+            </w:pPr>
+            <w:r>
+              <w:rPr>
+                <w:b/>
+                <w:bCs/>
+                <w:sz w:val="18"/>
+                <w:szCs w:val="20"/>
+              </w:rPr>
+              <w:t>Pico global</w:t>
+            </w:r>
+          </w:p>
+        </w:tc>
+        <w:tc>
+          <w:tcPr>
+            <w:tcW w:type="dxa" w:w="1020"/>
+            <w:tcBorders>
+              <w:top w:val="single" w:color="000000" w:sz="4"/>
+              <w:left w:val="single" w:color="000000" w:sz="4"/>
+              <w:bottom w:val="single" w:color="000000" w:sz="4"/>
+              <w:right w:val="single" w:color="000000" w:sz="4"/>
+            </w:tcBorders>
+            <w:shd w:fill="E7E6E6" w:color="auto" w:val="clear"/>
+            <w:tcMar>
+              <w:top w:type="dxa" w:w="30"/>
+              <w:left w:type="dxa" w:w="80"/>
+              <w:bottom w:type="dxa" w:w="30"/>
+              <w:right w:type="dxa" w:w="80"/>
+            </w:tcMar>
+            <w:vAlign w:val="center"/>
+          </w:tcPr>
+          <w:p>
+            <w:pPr>
+              <w:keepNext/>
+              <w:spacing w:after="0" w:line="240" w:lineRule="auto"/>
+              <w:jc w:val="center"/>
+            </w:pPr>
+            <w:r>
+              <w:rPr>
+                <w:b/>
+                <w:bCs/>
+                <w:sz w:val="18"/>
+                <w:szCs w:val="20"/>
+              </w:rPr>
+              <w:t>Pico local ±6</w:t>
+            </w:r>
+          </w:p>
+        </w:tc>
+        <w:tc>
+          <w:tcPr>
+            <w:tcW w:type="dxa" w:w="1984"/>
+            <w:tcBorders>
+              <w:top w:val="single" w:color="000000" w:sz="4"/>
+              <w:left w:val="single" w:color="000000" w:sz="4"/>
+              <w:bottom w:val="single" w:color="000000" w:sz="4"/>
+              <w:right w:val="single" w:color="000000" w:sz="4"/>
+            </w:tcBorders>
+            <w:shd w:fill="E7E6E6" w:color="auto" w:val="clear"/>
+            <w:tcMar>
+              <w:top w:type="dxa" w:w="30"/>
+              <w:left w:type="dxa" w:w="80"/>
+              <w:bottom w:type="dxa" w:w="30"/>
+              <w:right w:type="dxa" w:w="80"/>
+            </w:tcMar>
+            <w:vAlign w:val="center"/>
+          </w:tcPr>
+          <w:p>
+            <w:pPr>
+              <w:keepNext/>
+              <w:spacing w:after="0" w:line="240" w:lineRule="auto"/>
+              <w:jc w:val="center"/>
+            </w:pPr>
+            <w:r>
+              <w:rPr>
+                <w:sz w:val="18"/>
+              </w:rPr>
+              <w:t>Sensibilidad ±4/±6/±8</w:t>
+            </w:r>
+          </w:p>
+        </w:tc>
+        <w:tc>
+          <w:tcPr>
+            <w:tcW w:type="dxa" w:w="1474"/>
+            <w:tcBorders>
+              <w:top w:val="single" w:color="000000" w:sz="4"/>
+              <w:left w:val="single" w:color="000000" w:sz="4"/>
+              <w:bottom w:val="single" w:color="000000" w:sz="4"/>
+              <w:right w:val="single" w:color="000000" w:sz="4"/>
+            </w:tcBorders>
+            <w:shd w:fill="E7E6E6" w:color="auto" w:val="clear"/>
+            <w:tcMar>
+              <w:top w:type="dxa" w:w="30"/>
+              <w:left w:type="dxa" w:w="80"/>
+              <w:bottom w:type="dxa" w:w="30"/>
+              <w:right w:type="dxa" w:w="80"/>
+            </w:tcMar>
+            <w:vAlign w:val="center"/>
+          </w:tcPr>
+          <w:p>
+            <w:pPr>
+              <w:keepNext/>
+              <w:spacing w:after="0" w:line="240" w:lineRule="auto"/>
+              <w:jc w:val="center"/>
+            </w:pPr>
+            <w:r>
+              <w:rPr>
+                <w:b/>
+                <w:bCs/>
+                <w:sz w:val="18"/>
+                <w:szCs w:val="20"/>
+              </w:rPr>
+              <w:t>Diagnóstico</w:t>
+            </w:r>
+          </w:p>
+        </w:tc>
+      </w:tr>
+      <w:tr>
+        <w:trPr>
+          <w:cantSplit/>
+          <w:cantSplit/>
+        </w:trPr>
+        <w:tc>
+          <w:tcPr>
+            <w:tcW w:type="dxa" w:w="1531"/>
+            <w:tcBorders>
+              <w:top w:val="single" w:color="000000" w:sz="4"/>
+              <w:left w:val="single" w:color="000000" w:sz="4"/>
+              <w:bottom w:val="single" w:color="000000" w:sz="4"/>
+              <w:right w:val="single" w:color="000000" w:sz="4"/>
+            </w:tcBorders>
+            <w:tcMar>
+              <w:top w:type="dxa" w:w="30"/>
+              <w:left w:type="dxa" w:w="80"/>
+              <w:bottom w:type="dxa" w:w="30"/>
+              <w:right w:type="dxa" w:w="80"/>
+            </w:tcMar>
+            <w:vAlign w:val="center"/>
+          </w:tcPr>
+          <w:p>
+            <w:pPr>
+              <w:keepNext w:val="0"/>
+              <w:spacing w:after="0" w:line="240" w:lineRule="auto"/>
+              <w:jc w:val="left"/>
+            </w:pPr>
+            <w:r>
+              <w:rPr>
+                <w:sz w:val="18"/>
+                <w:szCs w:val="20"/>
+              </w:rPr>
+              <w:t>Rosa Pastel</w:t>
+            </w:r>
+          </w:p>
+        </w:tc>
+        <w:tc>
+          <w:tcPr>
+            <w:tcW w:type="dxa" w:w="850"/>
+            <w:tcBorders>
+              <w:top w:val="single" w:color="000000" w:sz="4"/>
+              <w:left w:val="single" w:color="000000" w:sz="4"/>
+              <w:bottom w:val="single" w:color="000000" w:sz="4"/>
+              <w:right w:val="single" w:color="000000" w:sz="4"/>
+            </w:tcBorders>
+            <w:tcMar>
+              <w:top w:type="dxa" w:w="30"/>
+              <w:left w:type="dxa" w:w="80"/>
+              <w:bottom w:type="dxa" w:w="30"/>
+              <w:right w:type="dxa" w:w="80"/>
+            </w:tcMar>
+            <w:vAlign w:val="center"/>
+          </w:tcPr>
+          <w:p>
+            <w:pPr>
+              <w:keepNext w:val="0"/>
+              <w:spacing w:after="0" w:line="240" w:lineRule="auto"/>
+              <w:jc w:val="center"/>
+            </w:pPr>
+            <w:r>
+              <w:rPr>
+                <w:sz w:val="18"/>
+                <w:szCs w:val="20"/>
+              </w:rPr>
+              <w:t>26</w:t>
+            </w:r>
+          </w:p>
+        </w:tc>
+        <w:tc>
+          <w:tcPr>
+            <w:tcW w:type="dxa" w:w="1077"/>
+            <w:tcBorders>
+              <w:top w:val="single" w:color="000000" w:sz="4"/>
+              <w:left w:val="single" w:color="000000" w:sz="4"/>
+              <w:bottom w:val="single" w:color="000000" w:sz="4"/>
+              <w:right w:val="single" w:color="000000" w:sz="4"/>
+            </w:tcBorders>
+            <w:tcMar>
+              <w:top w:type="dxa" w:w="30"/>
+              <w:left w:type="dxa" w:w="80"/>
+              <w:bottom w:type="dxa" w:w="30"/>
+              <w:right w:type="dxa" w:w="80"/>
+            </w:tcMar>
+            <w:vAlign w:val="center"/>
+          </w:tcPr>
+          <w:p>
+            <w:pPr>
+              <w:keepNext w:val="0"/>
+              <w:spacing w:after="0" w:line="240" w:lineRule="auto"/>
+              <w:jc w:val="center"/>
+            </w:pPr>
+            <w:r>
+              <w:rPr>
+                <w:sz w:val="18"/>
+                <w:szCs w:val="20"/>
+              </w:rPr>
+              <w:t>30,59</w:t>
+            </w:r>
+          </w:p>
+        </w:tc>
+        <w:tc>
+          <w:tcPr>
+            <w:tcW w:type="dxa" w:w="1020"/>
+            <w:tcBorders>
+              <w:top w:val="single" w:color="000000" w:sz="4"/>
+              <w:left w:val="single" w:color="000000" w:sz="4"/>
+              <w:bottom w:val="single" w:color="000000" w:sz="4"/>
+              <w:right w:val="single" w:color="000000" w:sz="4"/>
+            </w:tcBorders>
+            <w:tcMar>
+              <w:top w:type="dxa" w:w="30"/>
+              <w:left w:type="dxa" w:w="80"/>
+              <w:bottom w:type="dxa" w:w="30"/>
+              <w:right w:type="dxa" w:w="80"/>
+            </w:tcMar>
+            <w:vAlign w:val="center"/>
+          </w:tcPr>
+          <w:p>
+            <w:pPr>
+              <w:keepNext w:val="0"/>
+              <w:spacing w:after="0" w:line="240" w:lineRule="auto"/>
+              <w:jc w:val="center"/>
+            </w:pPr>
+            <w:r>
+              <w:rPr>
+                <w:sz w:val="18"/>
+                <w:szCs w:val="20"/>
+              </w:rPr>
+              <w:t>28,58</w:t>
+            </w:r>
+          </w:p>
+        </w:tc>
+        <w:tc>
+          <w:tcPr>
+            <w:tcW w:type="dxa" w:w="1984"/>
+            <w:tcBorders>
+              <w:top w:val="single" w:color="000000" w:sz="4"/>
+              <w:left w:val="single" w:color="000000" w:sz="4"/>
+              <w:bottom w:val="single" w:color="000000" w:sz="4"/>
+              <w:right w:val="single" w:color="000000" w:sz="4"/>
+            </w:tcBorders>
+            <w:tcMar>
+              <w:top w:type="dxa" w:w="30"/>
+              <w:left w:type="dxa" w:w="80"/>
+              <w:bottom w:type="dxa" w:w="30"/>
+              <w:right w:type="dxa" w:w="80"/>
+            </w:tcMar>
+            <w:vAlign w:val="center"/>
+          </w:tcPr>
+          <w:p>
+            <w:pPr>
+              <w:keepNext w:val="0"/>
+              <w:spacing w:after="0" w:line="240" w:lineRule="auto"/>
+              <w:jc w:val="center"/>
+            </w:pPr>
+            <w:r>
+              <w:rPr>
+                <w:sz w:val="18"/>
+                <w:szCs w:val="20"/>
+              </w:rPr>
+              <w:t>27,01/28,58/29,75</w:t>
+            </w:r>
+          </w:p>
+        </w:tc>
+        <w:tc>
+          <w:tcPr>
+            <w:tcW w:type="dxa" w:w="1474"/>
+            <w:tcBorders>
+              <w:top w:val="single" w:color="000000" w:sz="4"/>
+              <w:left w:val="single" w:color="000000" w:sz="4"/>
+              <w:bottom w:val="single" w:color="000000" w:sz="4"/>
+              <w:right w:val="single" w:color="000000" w:sz="4"/>
+            </w:tcBorders>
+            <w:tcMar>
+              <w:top w:type="dxa" w:w="30"/>
+              <w:left w:type="dxa" w:w="80"/>
+              <w:bottom w:type="dxa" w:w="30"/>
+              <w:right w:type="dxa" w:w="80"/>
+            </w:tcMar>
+            <w:vAlign w:val="center"/>
+          </w:tcPr>
+          <w:p>
+            <w:pPr>
+              <w:keepNext w:val="0"/>
+              <w:spacing w:after="0" w:line="240" w:lineRule="auto"/>
+              <w:jc w:val="center"/>
+            </w:pPr>
+            <w:r>
+              <w:rPr>
+                <w:sz w:val="18"/>
+                <w:szCs w:val="20"/>
+              </w:rPr>
+              <w:t>global y local</w:t>
+            </w:r>
+          </w:p>
+        </w:tc>
+      </w:tr>
+      <w:tr>
+        <w:trPr>
+          <w:cantSplit/>
+          <w:cantSplit/>
+        </w:trPr>
+        <w:tc>
+          <w:tcPr>
+            <w:tcW w:type="dxa" w:w="1531"/>
+            <w:tcBorders>
+              <w:top w:val="single" w:color="000000" w:sz="4"/>
+              <w:left w:val="single" w:color="000000" w:sz="4"/>
+              <w:bottom w:val="single" w:color="000000" w:sz="4"/>
+              <w:right w:val="single" w:color="000000" w:sz="4"/>
+            </w:tcBorders>
+            <w:tcMar>
+              <w:top w:type="dxa" w:w="30"/>
+              <w:left w:type="dxa" w:w="80"/>
+              <w:bottom w:type="dxa" w:w="30"/>
+              <w:right w:type="dxa" w:w="80"/>
+            </w:tcMar>
+            <w:vAlign w:val="center"/>
+          </w:tcPr>
+          <w:p>
+            <w:pPr>
+              <w:keepNext w:val="0"/>
+              <w:spacing w:after="0" w:line="240" w:lineRule="auto"/>
+              <w:jc w:val="left"/>
+            </w:pPr>
+            <w:r>
+              <w:rPr>
+                <w:sz w:val="18"/>
+                <w:szCs w:val="20"/>
+              </w:rPr>
+              <w:t>Ella Baila Sola</w:t>
+            </w:r>
+          </w:p>
+        </w:tc>
+        <w:tc>
+          <w:tcPr>
+            <w:tcW w:type="dxa" w:w="850"/>
+            <w:tcBorders>
+              <w:top w:val="single" w:color="000000" w:sz="4"/>
+              <w:left w:val="single" w:color="000000" w:sz="4"/>
+              <w:bottom w:val="single" w:color="000000" w:sz="4"/>
+              <w:right w:val="single" w:color="000000" w:sz="4"/>
+            </w:tcBorders>
+            <w:tcMar>
+              <w:top w:type="dxa" w:w="30"/>
+              <w:left w:type="dxa" w:w="80"/>
+              <w:bottom w:type="dxa" w:w="30"/>
+              <w:right w:type="dxa" w:w="80"/>
+            </w:tcMar>
+            <w:vAlign w:val="center"/>
+          </w:tcPr>
+          <w:p>
+            <w:pPr>
+              <w:keepNext w:val="0"/>
+              <w:spacing w:after="0" w:line="240" w:lineRule="auto"/>
+              <w:jc w:val="center"/>
+            </w:pPr>
+            <w:r>
+              <w:rPr>
+                <w:sz w:val="18"/>
+                <w:szCs w:val="20"/>
+              </w:rPr>
+              <w:t>5</w:t>
+            </w:r>
+          </w:p>
+        </w:tc>
+        <w:tc>
+          <w:tcPr>
+            <w:tcW w:type="dxa" w:w="1077"/>
+            <w:tcBorders>
+              <w:top w:val="single" w:color="000000" w:sz="4"/>
+              <w:left w:val="single" w:color="000000" w:sz="4"/>
+              <w:bottom w:val="single" w:color="000000" w:sz="4"/>
+              <w:right w:val="single" w:color="000000" w:sz="4"/>
+            </w:tcBorders>
+            <w:tcMar>
+              <w:top w:type="dxa" w:w="30"/>
+              <w:left w:type="dxa" w:w="80"/>
+              <w:bottom w:type="dxa" w:w="30"/>
+              <w:right w:type="dxa" w:w="80"/>
+            </w:tcMar>
+            <w:vAlign w:val="center"/>
+          </w:tcPr>
+          <w:p>
+            <w:pPr>
+              <w:keepNext w:val="0"/>
+              <w:spacing w:after="0" w:line="240" w:lineRule="auto"/>
+              <w:jc w:val="center"/>
+            </w:pPr>
+            <w:r>
+              <w:rPr>
+                <w:sz w:val="18"/>
+                <w:szCs w:val="20"/>
+              </w:rPr>
+              <w:t>no detecta</w:t>
+            </w:r>
+          </w:p>
+        </w:tc>
+        <w:tc>
+          <w:tcPr>
+            <w:tcW w:type="dxa" w:w="1020"/>
+            <w:tcBorders>
+              <w:top w:val="single" w:color="000000" w:sz="4"/>
+              <w:left w:val="single" w:color="000000" w:sz="4"/>
+              <w:bottom w:val="single" w:color="000000" w:sz="4"/>
+              <w:right w:val="single" w:color="000000" w:sz="4"/>
+            </w:tcBorders>
+            <w:tcMar>
+              <w:top w:type="dxa" w:w="30"/>
+              <w:left w:type="dxa" w:w="80"/>
+              <w:bottom w:type="dxa" w:w="30"/>
+              <w:right w:type="dxa" w:w="80"/>
+            </w:tcMar>
+            <w:vAlign w:val="center"/>
+          </w:tcPr>
+          <w:p>
+            <w:pPr>
+              <w:keepNext w:val="0"/>
+              <w:spacing w:after="0" w:line="240" w:lineRule="auto"/>
+              <w:jc w:val="center"/>
+            </w:pPr>
+            <w:r>
+              <w:rPr>
+                <w:sz w:val="18"/>
+                <w:szCs w:val="20"/>
+              </w:rPr>
+              <w:t>3,78</w:t>
+            </w:r>
+          </w:p>
+        </w:tc>
+        <w:tc>
+          <w:tcPr>
+            <w:tcW w:type="dxa" w:w="1984"/>
+            <w:tcBorders>
+              <w:top w:val="single" w:color="000000" w:sz="4"/>
+              <w:left w:val="single" w:color="000000" w:sz="4"/>
+              <w:bottom w:val="single" w:color="000000" w:sz="4"/>
+              <w:right w:val="single" w:color="000000" w:sz="4"/>
+            </w:tcBorders>
+            <w:tcMar>
+              <w:top w:type="dxa" w:w="30"/>
+              <w:left w:type="dxa" w:w="80"/>
+              <w:bottom w:type="dxa" w:w="30"/>
+              <w:right w:type="dxa" w:w="80"/>
+            </w:tcMar>
+            <w:vAlign w:val="center"/>
+          </w:tcPr>
+          <w:p>
+            <w:pPr>
+              <w:keepNext w:val="0"/>
+              <w:spacing w:after="0" w:line="240" w:lineRule="auto"/>
+              <w:jc w:val="center"/>
+            </w:pPr>
+            <w:r>
+              <w:rPr>
+                <w:sz w:val="18"/>
+                <w:szCs w:val="20"/>
+              </w:rPr>
+              <w:t>3,96/3,78/2,83</w:t>
+            </w:r>
+          </w:p>
+        </w:tc>
+        <w:tc>
+          <w:tcPr>
+            <w:tcW w:type="dxa" w:w="1474"/>
+            <w:tcBorders>
+              <w:top w:val="single" w:color="000000" w:sz="4"/>
+              <w:left w:val="single" w:color="000000" w:sz="4"/>
+              <w:bottom w:val="single" w:color="000000" w:sz="4"/>
+              <w:right w:val="single" w:color="000000" w:sz="4"/>
+            </w:tcBorders>
+            <w:tcMar>
+              <w:top w:type="dxa" w:w="30"/>
+              <w:left w:type="dxa" w:w="80"/>
+              <w:bottom w:type="dxa" w:w="30"/>
+              <w:right w:type="dxa" w:w="80"/>
+            </w:tcMar>
+            <w:vAlign w:val="center"/>
+          </w:tcPr>
+          <w:p>
+            <w:pPr>
+              <w:keepNext w:val="0"/>
+              <w:spacing w:after="0" w:line="240" w:lineRule="auto"/>
+              <w:jc w:val="center"/>
+            </w:pPr>
+            <w:r>
+              <w:rPr>
+                <w:sz w:val="18"/>
+                <w:szCs w:val="20"/>
+              </w:rPr>
+              <w:t>solo local</w:t>
+            </w:r>
+          </w:p>
+        </w:tc>
+      </w:tr>
+      <w:tr>
+        <w:trPr>
+          <w:cantSplit/>
+          <w:cantSplit/>
+        </w:trPr>
+        <w:tc>
+          <w:tcPr>
+            <w:tcW w:type="dxa" w:w="1531"/>
+            <w:tcBorders>
+              <w:top w:val="single" w:color="000000" w:sz="4"/>
+              <w:left w:val="single" w:color="000000" w:sz="4"/>
+              <w:bottom w:val="single" w:color="000000" w:sz="4"/>
+              <w:right w:val="single" w:color="000000" w:sz="4"/>
+            </w:tcBorders>
+            <w:tcMar>
+              <w:top w:type="dxa" w:w="30"/>
+              <w:left w:type="dxa" w:w="80"/>
+              <w:bottom w:type="dxa" w:w="30"/>
+              <w:right w:type="dxa" w:w="80"/>
+            </w:tcMar>
+            <w:vAlign w:val="center"/>
+          </w:tcPr>
+          <w:p>
+            <w:pPr>
+              <w:keepNext w:val="0"/>
+              <w:spacing w:after="0" w:line="240" w:lineRule="auto"/>
+              <w:jc w:val="left"/>
+            </w:pPr>
+            <w:r>
+              <w:rPr>
+                <w:sz w:val="18"/>
+                <w:szCs w:val="20"/>
+              </w:rPr>
+              <w:t>Tití Me Preguntó</w:t>
+            </w:r>
+          </w:p>
+        </w:tc>
+        <w:tc>
+          <w:tcPr>
+            <w:tcW w:type="dxa" w:w="850"/>
+            <w:tcBorders>
+              <w:top w:val="single" w:color="000000" w:sz="4"/>
+              <w:left w:val="single" w:color="000000" w:sz="4"/>
+              <w:bottom w:val="single" w:color="000000" w:sz="4"/>
+              <w:right w:val="single" w:color="000000" w:sz="4"/>
+            </w:tcBorders>
+            <w:tcMar>
+              <w:top w:type="dxa" w:w="30"/>
+              <w:left w:type="dxa" w:w="80"/>
+              <w:bottom w:type="dxa" w:w="30"/>
+              <w:right w:type="dxa" w:w="80"/>
+            </w:tcMar>
+            <w:vAlign w:val="center"/>
+          </w:tcPr>
+          <w:p>
+            <w:pPr>
+              <w:keepNext w:val="0"/>
+              <w:spacing w:after="0" w:line="240" w:lineRule="auto"/>
+              <w:jc w:val="center"/>
+            </w:pPr>
+            <w:r>
+              <w:rPr>
+                <w:sz w:val="18"/>
+                <w:szCs w:val="20"/>
+              </w:rPr>
+              <w:t>6</w:t>
+            </w:r>
+          </w:p>
+        </w:tc>
+        <w:tc>
+          <w:tcPr>
+            <w:tcW w:type="dxa" w:w="1077"/>
+            <w:tcBorders>
+              <w:top w:val="single" w:color="000000" w:sz="4"/>
+              <w:left w:val="single" w:color="000000" w:sz="4"/>
+              <w:bottom w:val="single" w:color="000000" w:sz="4"/>
+              <w:right w:val="single" w:color="000000" w:sz="4"/>
+            </w:tcBorders>
+            <w:tcMar>
+              <w:top w:type="dxa" w:w="30"/>
+              <w:left w:type="dxa" w:w="80"/>
+              <w:bottom w:type="dxa" w:w="30"/>
+              <w:right w:type="dxa" w:w="80"/>
+            </w:tcMar>
+            <w:vAlign w:val="center"/>
+          </w:tcPr>
+          <w:p>
+            <w:pPr>
+              <w:keepNext w:val="0"/>
+              <w:spacing w:after="0" w:line="240" w:lineRule="auto"/>
+              <w:jc w:val="center"/>
+            </w:pPr>
+            <w:r>
+              <w:rPr>
+                <w:sz w:val="18"/>
+                <w:szCs w:val="20"/>
+              </w:rPr>
+              <w:t>no detecta</w:t>
+            </w:r>
+          </w:p>
+        </w:tc>
+        <w:tc>
+          <w:tcPr>
+            <w:tcW w:type="dxa" w:w="1020"/>
+            <w:tcBorders>
+              <w:top w:val="single" w:color="000000" w:sz="4"/>
+              <w:left w:val="single" w:color="000000" w:sz="4"/>
+              <w:bottom w:val="single" w:color="000000" w:sz="4"/>
+              <w:right w:val="single" w:color="000000" w:sz="4"/>
+            </w:tcBorders>
+            <w:tcMar>
+              <w:top w:type="dxa" w:w="30"/>
+              <w:left w:type="dxa" w:w="80"/>
+              <w:bottom w:type="dxa" w:w="30"/>
+              <w:right w:type="dxa" w:w="80"/>
+            </w:tcMar>
+            <w:vAlign w:val="center"/>
+          </w:tcPr>
+          <w:p>
+            <w:pPr>
+              <w:keepNext w:val="0"/>
+              <w:spacing w:after="0" w:line="240" w:lineRule="auto"/>
+              <w:jc w:val="center"/>
+            </w:pPr>
+            <w:r>
+              <w:rPr>
+                <w:sz w:val="18"/>
+                <w:szCs w:val="20"/>
+              </w:rPr>
+              <w:t>6,41</w:t>
+            </w:r>
+          </w:p>
+        </w:tc>
+        <w:tc>
+          <w:tcPr>
+            <w:tcW w:type="dxa" w:w="1984"/>
+            <w:tcBorders>
+              <w:top w:val="single" w:color="000000" w:sz="4"/>
+              <w:left w:val="single" w:color="000000" w:sz="4"/>
+              <w:bottom w:val="single" w:color="000000" w:sz="4"/>
+              <w:right w:val="single" w:color="000000" w:sz="4"/>
+            </w:tcBorders>
+            <w:tcMar>
+              <w:top w:type="dxa" w:w="30"/>
+              <w:left w:type="dxa" w:w="80"/>
+              <w:bottom w:type="dxa" w:w="30"/>
+              <w:right w:type="dxa" w:w="80"/>
+            </w:tcMar>
+            <w:vAlign w:val="center"/>
+          </w:tcPr>
+          <w:p>
+            <w:pPr>
+              <w:keepNext w:val="0"/>
+              <w:spacing w:after="0" w:line="240" w:lineRule="auto"/>
+              <w:jc w:val="center"/>
+            </w:pPr>
+            <w:r>
+              <w:rPr>
+                <w:sz w:val="18"/>
+                <w:szCs w:val="20"/>
+              </w:rPr>
+              <w:t>5,88/6,41/6,85</w:t>
+            </w:r>
+          </w:p>
+        </w:tc>
+        <w:tc>
+          <w:tcPr>
+            <w:tcW w:type="dxa" w:w="1474"/>
+            <w:tcBorders>
+              <w:top w:val="single" w:color="000000" w:sz="4"/>
+              <w:left w:val="single" w:color="000000" w:sz="4"/>
+              <w:bottom w:val="single" w:color="000000" w:sz="4"/>
+              <w:right w:val="single" w:color="000000" w:sz="4"/>
+            </w:tcBorders>
+            <w:tcMar>
+              <w:top w:type="dxa" w:w="30"/>
+              <w:left w:type="dxa" w:w="80"/>
+              <w:bottom w:type="dxa" w:w="30"/>
+              <w:right w:type="dxa" w:w="80"/>
+            </w:tcMar>
+            <w:vAlign w:val="center"/>
+          </w:tcPr>
+          <w:p>
+            <w:pPr>
+              <w:keepNext w:val="0"/>
+              <w:spacing w:after="0" w:line="240" w:lineRule="auto"/>
+              <w:jc w:val="center"/>
+            </w:pPr>
+            <w:r>
+              <w:rPr>
+                <w:sz w:val="18"/>
+                <w:szCs w:val="20"/>
+              </w:rPr>
+              <w:t>solo local</w:t>
+            </w:r>
+          </w:p>
+        </w:tc>
+      </w:tr>
+    </w:tbl>
+    <w:p>
+      <w:pPr>
+        <w:spacing w:before="120"/>
+        <w:ind w:firstLine="720"/>
+        <w:jc w:val="both"/>
+      </w:pPr>
+      <w:r>
+        <w:t>Al cambiar la semiventana entre 4, 6 y 8 semanas, el pico se mueve aproximadamente entre una y tres semanas según la canción. Por eso se informa la sensibilidad: la ventana es un parámetro elegido y el resultado describe un pico ya contenido en los datos, no pronostica uno futuro.</w:t>
       </w:r>
     </w:p>
     <w:p>
@@ -34019,13 +34906,7 @@
         <w:spacing w:after="240" w:before="60"/>
       </w:pPr>
       <w:r>
-        <w:rPr>
-          <w:i/>
-          <w:iCs/>
-          <w:sz w:val="20"/>
-          <w:szCs w:val="20"/>
-        </w:rPr>
-        <w:t xml:space="preserve">Figura 4. Reproducciones semanales y derivada del modelo cúbico para las tres canciones analizadas.</w:t>
+        <w:t>Figura 4. Streams semanales y derivadas de los ajustes cúbicos global y local. La curva local se muestra solo en su ventana de ±6 semanas; la línea punteada señala su pico.</w:t>
       </w:r>
     </w:p>
     <w:p>
@@ -34539,7 +35420,7 @@
           <w:sz w:val="20"/>
           <w:szCs w:val="20"/>
         </w:rPr>
-        <w:t xml:space="preserve">Tabla 11. Supuestos del dimensionamiento.</w:t>
+        <w:t>Tabla 12. Supuestos del dimensionamiento.</w:t>
       </w:r>
     </w:p>
     <w:tbl>
@@ -35241,7 +36122,7 @@
         <w:jc w:val="both"/>
       </w:pPr>
       <w:r>
-        <w:t xml:space="preserve">La Tabla 12 presenta los resultados para las tres tasas de bits. A modo de ejemplo, con la tasa de referencia cada reproducción ocupa 3,72 MB y el máximo semanal medido (</w:t>
+        <w:t>La Tabla 13 presenta los resultados para las tres tasas de bits. A modo de ejemplo, con la tasa de referencia cada reproducción ocupa 3,72 MB y el máximo semanal medido (</w:t>
       </w:r>
       <m:oMath>
         <m:r>
@@ -35397,7 +36278,7 @@
           <w:sz w:val="20"/>
           <w:szCs w:val="20"/>
         </w:rPr>
-        <w:t xml:space="preserve">Tabla 12. Ancho de banda y volumen transferido para «Rosa Pastel» en Spotify México.</w:t>
+        <w:t>Tabla 13. Ancho de banda y volumen transferido para «Rosa Pastel» en Spotify México.</w:t>
       </w:r>
     </w:p>
     <w:tbl>
@@ -37187,7 +38068,7 @@
         </m:r>
       </m:oMath>
       <w:r>
-        <w:t xml:space="preserve">. La Tabla 13 resume los resultados y la Tabla 14 detalla las iteraciones de Newton-Raphson para la primera raíz.</w:t>
+        <w:t>. La Tabla 14 resume los resultados y la Tabla 15 detalla las iteraciones de Newton-Raphson para la primera raíz.</w:t>
       </w:r>
     </w:p>
     <w:p>
@@ -37203,7 +38084,7 @@
           <w:sz w:val="20"/>
           <w:szCs w:val="20"/>
         </w:rPr>
-        <w:t xml:space="preserve">Tabla 13. Raíces de </w:t>
+        <w:t xml:space="preserve">Tabla 14. Raíces de </w:t>
       </w:r>
       <m:oMath>
         <m:r>
@@ -38423,7 +39304,7 @@
           <w:sz w:val="20"/>
           <w:szCs w:val="20"/>
         </w:rPr>
-        <w:t xml:space="preserve">Tabla 14. Método de Newton-Raphson aplicado a </w:t>
+        <w:t xml:space="preserve">Tabla 15. Método de Newton-Raphson aplicado a </w:t>
       </w:r>
       <m:oMath>
         <m:r>
@@ -40352,6 +41233,29 @@
     </w:p>
     <w:p>
       <w:pPr>
+        <w:pStyle w:val="ListParagraph"/>
+        <w:numPr>
+          <w:ilvl w:val="0"/>
+          <w:numId w:val="10"/>
+        </w:numPr>
+        <w:spacing w:after="100"/>
+        <w:jc w:val="both"/>
+      </w:pPr>
+      <w:r>
+        <w:rPr>
+          <w:b/>
+        </w:rPr>
+        <w:t>Ventana local.</w:t>
+      </w:r>
+      <w:r>
+        <w:rPr>
+          <w:b w:val="0"/>
+        </w:rPr>
+        <w:t xml:space="preserve"> El pico debe estar contenido en los datos y se necesita una ventana con suficientes semanas para ajustar la cúbica. El ancho de ±6 semanas es un parámetro elegido: cambiarlo desplaza el pico, como muestra la sensibilidad de la Tabla 11. El ajuste local no permite pronosticar un pico futuro.</w:t>
+      </w:r>
+    </w:p>
+    <w:p>
+      <w:pPr>
         <w:pStyle w:val="Heading1"/>
         <w:pageBreakBefore/>
       </w:pPr>
@@ -40546,12 +41450,14 @@
       <w:r>
         <w:rPr>
           <w:b/>
-          <w:bCs/>
         </w:rPr>
-        <w:t xml:space="preserve">Sobre la generalización.</w:t>
+        <w:t>Sobre la generalización.</w:t>
       </w:r>
       <w:r>
-        <w:t xml:space="preserve"> El mismo procedimiento se aplicó sin cambios a otras dos canciones. La comparación mostró que el modelo cúbico es adecuado para resurgimientos graduales, pero no para estrenos cuyo máximo se produce al comienzo, caso en el que el programa lo detecta y lo informa.</w:t>
+        <w:rPr>
+          <w:b w:val="0"/>
+        </w:rPr>
+        <w:t xml:space="preserve"> El método se generaliza a los tres casos al aplicar la misma cúbica localmente alrededor del pico medido, con la misma eliminación gaussiana. La herramienta valida su propio modelo al comprobar a &lt; 0 y que el pico quede dentro de la ventana, y muestra la sensibilidad al ancho elegido.</w:t>
       </w:r>
     </w:p>
     <w:p>

</xml_diff>

<commit_message>
Informe: notación a3/a2 y ecuaciones de Word en la regresión cúbica local (3.5.1)
Co-Authored-By: Claude Opus 5.5 <noreply@anthropic.com>
</commit_message>
<xml_diff>
--- a/ENTREGABLES/Informe_Proyecto_Metodos_Numericos_Rosa_Pastel.docx
+++ b/ENTREGABLES/Informe_Proyecto_Metodos_Numericos_Rosa_Pastel.docx
@@ -380,7 +380,7 @@
             </w:tabs>
           </w:pPr>
           <w:r>
-            <w:fldChar w:fldCharType="begin" w:dirty="true"/>
+            <w:fldChar w:fldCharType="begin"/>
           </w:r>
           <w:r>
             <w:instrText xml:space="preserve">TOC \h \o "1-3"</w:instrText>
@@ -893,6 +893,23 @@
         </w:p>
         <w:p>
           <w:pPr>
+            <w:pStyle w:val="TOC3"/>
+            <w:tabs>
+              <w:tab w:val="right" w:leader="dot" w:pos="8844"/>
+            </w:tabs>
+          </w:pPr>
+          <w:r>
+            <w:t xml:space="preserve">3.5.1. Regresión cúbica local</w:t>
+          </w:r>
+          <w:r>
+            <w:tab/>
+          </w:r>
+          <w:r>
+            <w:t>23</w:t>
+          </w:r>
+        </w:p>
+        <w:p>
+          <w:pPr>
             <w:pStyle w:val="TOC2"/>
             <w:tabs>
               <w:tab w:val="right" w:leader="dot" w:pos="8844"/>
@@ -905,7 +922,7 @@
             <w:tab/>
           </w:r>
           <w:r>
-            <w:t>24</w:t>
+            <w:t>25</w:t>
           </w:r>
         </w:p>
         <w:p>
@@ -922,7 +939,7 @@
             <w:tab/>
           </w:r>
           <w:r>
-            <w:t>24</w:t>
+            <w:t>25</w:t>
           </w:r>
         </w:p>
         <w:p>
@@ -939,7 +956,7 @@
             <w:tab/>
           </w:r>
           <w:r>
-            <w:t>25</w:t>
+            <w:t>26</w:t>
           </w:r>
         </w:p>
         <w:p>
@@ -956,7 +973,7 @@
             <w:tab/>
           </w:r>
           <w:r>
-            <w:t>25</w:t>
+            <w:t>26</w:t>
           </w:r>
         </w:p>
         <w:p>
@@ -973,7 +990,7 @@
             <w:tab/>
           </w:r>
           <w:r>
-            <w:t>26</w:t>
+            <w:t>27</w:t>
           </w:r>
         </w:p>
         <w:p>
@@ -990,7 +1007,7 @@
             <w:tab/>
           </w:r>
           <w:r>
-            <w:t>28</w:t>
+            <w:t>29</w:t>
           </w:r>
         </w:p>
         <w:p>
@@ -1007,7 +1024,7 @@
             <w:tab/>
           </w:r>
           <w:r>
-            <w:t>30</w:t>
+            <w:t>31</w:t>
           </w:r>
         </w:p>
         <w:p>
@@ -1024,7 +1041,7 @@
             <w:tab/>
           </w:r>
           <w:r>
-            <w:t>32</w:t>
+            <w:t>33</w:t>
           </w:r>
         </w:p>
         <w:p>
@@ -1041,7 +1058,7 @@
             <w:tab/>
           </w:r>
           <w:r>
-            <w:t>34</w:t>
+            <w:t>35</w:t>
           </w:r>
         </w:p>
         <w:p>
@@ -1058,7 +1075,7 @@
             <w:tab/>
           </w:r>
           <w:r>
-            <w:t>35</w:t>
+            <w:t>36</w:t>
           </w:r>
           <w:r>
             <w:fldChar w:fldCharType="end"/>
@@ -33974,7 +33991,171 @@
         <w:jc w:val="both"/>
       </w:pPr>
       <w:r>
-        <w:t>La derivada S′(t) de una cúbica es una parábola: si a &lt; 0, tiene una sola joroba simétrica. En «Rosa Pastel», el pico medido está hacia la mitad del período (semana 26 de 47), por lo que esa forma representa la tendencia. En los estrenos, el pico está en la semana 5 o 6 y después siguen muchas semanas de caída lenta. Mínimos cuadrados asigna el mismo peso a todas las semanas: la cola larga lleva al ajuste global a abrir hacia arriba (a &gt; 0), y t = −b/(3a) resulta un mínimo del ritmo.</w:t>
+        <w:t xml:space="preserve">La derivada </w:t>
+      </w:r>
+      <m:oMath>
+        <m:sSup>
+          <m:e>
+            <m:r>
+              <m:t>S</m:t>
+            </m:r>
+          </m:e>
+          <m:sup>
+            <m:r>
+              <m:rPr>
+                <m:sty m:val="p"/>
+              </m:rPr>
+              <m:t>′</m:t>
+            </m:r>
+          </m:sup>
+        </m:sSup>
+        <m:r>
+          <m:rPr>
+            <m:sty m:val="p"/>
+          </m:rPr>
+          <m:t>(</m:t>
+        </m:r>
+        <m:r>
+          <m:t>t</m:t>
+        </m:r>
+        <m:r>
+          <m:rPr>
+            <m:sty m:val="p"/>
+          </m:rPr>
+          <m:t>)</m:t>
+        </m:r>
+      </m:oMath>
+      <w:r>
+        <w:t xml:space="preserve"> de una cúbica es una parábola: </w:t>
+      </w:r>
+      <w:r>
+        <w:t xml:space="preserve">si </w:t>
+      </w:r>
+      <m:oMath>
+        <m:sSub>
+          <m:e>
+            <m:r>
+              <m:t>a</m:t>
+            </m:r>
+          </m:e>
+          <m:sub>
+            <m:r>
+              <m:t>3</m:t>
+            </m:r>
+          </m:sub>
+        </m:sSub>
+        <m:r>
+          <m:rPr>
+            <m:sty m:val="p"/>
+          </m:rPr>
+          <m:t>&lt;</m:t>
+        </m:r>
+        <m:r>
+          <m:t>0</m:t>
+        </m:r>
+      </m:oMath>
+      <w:r>
+        <w:t xml:space="preserve">,</w:t>
+      </w:r>
+      <w:r>
+        <w:t xml:space="preserve"> tiene una sola joroba simétrica. En «Rosa Pastel», el pico medido está hacia la mitad del período (semana 26 de 47), por lo que esa forma representa la tendencia. En los estrenos, el pico está en la semana 5 o 6 y después siguen muchas semanas de caída lenta. Mínimos cuadrados asigna el mismo peso a todas las semanas: la cola larga lleva al ajuste global a abrir hacia arriba </w:t>
+      </w:r>
+      <w:r>
+        <w:t xml:space="preserve">(</w:t>
+      </w:r>
+      <m:oMath>
+        <m:sSub>
+          <m:e>
+            <m:r>
+              <m:t>a</m:t>
+            </m:r>
+          </m:e>
+          <m:sub>
+            <m:r>
+              <m:t>3</m:t>
+            </m:r>
+          </m:sub>
+        </m:sSub>
+        <m:r>
+          <m:rPr>
+            <m:sty m:val="p"/>
+          </m:rPr>
+          <m:t>&gt;</m:t>
+        </m:r>
+        <m:r>
+          <m:t>0</m:t>
+        </m:r>
+      </m:oMath>
+      <w:r>
+        <w:t xml:space="preserve">), y </w:t>
+      </w:r>
+      <m:oMath>
+        <m:r>
+          <m:t>t</m:t>
+        </m:r>
+        <m:r>
+          <m:rPr>
+            <m:sty m:val="p"/>
+          </m:rPr>
+          <m:t>=</m:t>
+        </m:r>
+        <m:r>
+          <m:rPr>
+            <m:sty m:val="p"/>
+          </m:rPr>
+          <m:t>−</m:t>
+        </m:r>
+        <m:sSub>
+          <m:e>
+            <m:r>
+              <m:t>a</m:t>
+            </m:r>
+          </m:e>
+          <m:sub>
+            <m:r>
+              <m:t>2</m:t>
+            </m:r>
+          </m:sub>
+        </m:sSub>
+        <m:r>
+          <m:rPr>
+            <m:sty m:val="p"/>
+          </m:rPr>
+          <m:t>/</m:t>
+        </m:r>
+        <m:r>
+          <m:rPr>
+            <m:sty m:val="p"/>
+          </m:rPr>
+          <m:t>(</m:t>
+        </m:r>
+        <m:r>
+          <m:t>3</m:t>
+        </m:r>
+        <m:sSub>
+          <m:e>
+            <m:r>
+              <m:t>a</m:t>
+            </m:r>
+          </m:e>
+          <m:sub>
+            <m:r>
+              <m:t>3</m:t>
+            </m:r>
+          </m:sub>
+        </m:sSub>
+        <m:r>
+          <m:rPr>
+            <m:sty m:val="p"/>
+          </m:rPr>
+          <m:t>)</m:t>
+        </m:r>
+      </m:oMath>
+      <w:r>
+        <w:t xml:space="preserve"> resulta</w:t>
+      </w:r>
+      <w:r>
+        <w:t xml:space="preserve"> un mínimo del ritmo.</w:t>
       </w:r>
     </w:p>
     <w:p>
@@ -33983,7 +34164,306 @@
         <w:jc w:val="both"/>
       </w:pPr>
       <w:r>
-        <w:t>Para generalizar la detección se ajusta la misma cúbica del acumulado S(t), con las mismas ecuaciones normales y eliminación gaussiana, solo en [m−6, m+6], recortada a [0, n−1]. La semana m es la de mayor cantidad de streams semanales, equivalente al máximo de las diferencias hacia atrás del acumulado. La ventana de ±6 semanas abarca aproximadamente un trimestre centrado en ese pico. Se conserva la regla: t = −b/(3a) es un pico válido si a &lt; 0 y cae dentro de la ventana; el ritmo se obtiene evaluando S′(t).</w:t>
+        <w:t xml:space="preserve">Para generalizar la detección se ajusta la misma cúbica </w:t>
+      </w:r>
+      <w:r>
+        <w:t xml:space="preserve">del acumulado </w:t>
+      </w:r>
+      <m:oMath>
+        <m:r>
+          <m:t>S</m:t>
+        </m:r>
+        <m:r>
+          <m:rPr>
+            <m:sty m:val="p"/>
+          </m:rPr>
+          <m:t>(</m:t>
+        </m:r>
+        <m:r>
+          <m:t>t</m:t>
+        </m:r>
+        <m:r>
+          <m:rPr>
+            <m:sty m:val="p"/>
+          </m:rPr>
+          <m:t>)</m:t>
+        </m:r>
+      </m:oMath>
+      <w:r>
+        <w:t xml:space="preserve">,</w:t>
+      </w:r>
+      <w:r>
+        <w:t xml:space="preserve"> con las mismas ecuaciones normales y eliminación gaussiana, </w:t>
+      </w:r>
+      <w:r>
+        <w:t xml:space="preserve">solo en </w:t>
+      </w:r>
+      <m:oMath>
+        <m:r>
+          <m:rPr>
+            <m:sty m:val="p"/>
+          </m:rPr>
+          <m:t>[</m:t>
+        </m:r>
+        <m:r>
+          <m:t>m</m:t>
+        </m:r>
+        <m:r>
+          <m:rPr>
+            <m:sty m:val="p"/>
+          </m:rPr>
+          <m:t>−</m:t>
+        </m:r>
+        <m:r>
+          <m:t>6</m:t>
+        </m:r>
+        <m:r>
+          <m:rPr>
+            <m:sty m:val="p"/>
+          </m:rPr>
+          <m:t>;</m:t>
+        </m:r>
+        <m:r>
+          <m:t> </m:t>
+        </m:r>
+        <m:r>
+          <m:t>m</m:t>
+        </m:r>
+        <m:r>
+          <m:rPr>
+            <m:sty m:val="p"/>
+          </m:rPr>
+          <m:t>+</m:t>
+        </m:r>
+        <m:r>
+          <m:t>6</m:t>
+        </m:r>
+        <m:r>
+          <m:rPr>
+            <m:sty m:val="p"/>
+          </m:rPr>
+          <m:t>]</m:t>
+        </m:r>
+      </m:oMath>
+      <w:r>
+        <w:t xml:space="preserve">, recortada a </w:t>
+      </w:r>
+      <m:oMath>
+        <m:r>
+          <m:rPr>
+            <m:sty m:val="p"/>
+          </m:rPr>
+          <m:t>[</m:t>
+        </m:r>
+        <m:r>
+          <m:t>0</m:t>
+        </m:r>
+        <m:r>
+          <m:rPr>
+            <m:sty m:val="p"/>
+          </m:rPr>
+          <m:t>;</m:t>
+        </m:r>
+        <m:r>
+          <m:t> </m:t>
+        </m:r>
+        <m:r>
+          <m:t>n</m:t>
+        </m:r>
+        <m:r>
+          <m:rPr>
+            <m:sty m:val="p"/>
+          </m:rPr>
+          <m:t>−</m:t>
+        </m:r>
+        <m:r>
+          <m:t>1</m:t>
+        </m:r>
+        <m:r>
+          <m:rPr>
+            <m:sty m:val="p"/>
+          </m:rPr>
+          <m:t>]</m:t>
+        </m:r>
+      </m:oMath>
+      <w:r>
+        <w:t xml:space="preserve">. La semana </w:t>
+      </w:r>
+      <m:oMath>
+        <m:r>
+          <m:t>m</m:t>
+        </m:r>
+      </m:oMath>
+      <w:r>
+        <w:t xml:space="preserve"> es</w:t>
+      </w:r>
+      <w:r>
+        <w:t xml:space="preserve"> la de mayor cantidad de streams semanales, equivalente al máximo de las diferencias hacia atrás del acumulado. La ventana de ±6 semanas abarca aproximadamente un trimestre centrado en ese pico. Se conserva </w:t>
+      </w:r>
+      <w:r>
+        <w:t xml:space="preserve">la regla: </w:t>
+      </w:r>
+      <m:oMath>
+        <m:sSub>
+          <m:e>
+            <m:r>
+              <m:t>t</m:t>
+            </m:r>
+          </m:e>
+          <m:sub>
+            <m:r>
+              <m:t>p</m:t>
+            </m:r>
+            <m:r>
+              <m:t>i</m:t>
+            </m:r>
+            <m:r>
+              <m:t>c</m:t>
+            </m:r>
+            <m:r>
+              <m:t>o</m:t>
+            </m:r>
+          </m:sub>
+        </m:sSub>
+        <m:r>
+          <m:rPr>
+            <m:sty m:val="p"/>
+          </m:rPr>
+          <m:t>=</m:t>
+        </m:r>
+        <m:r>
+          <m:rPr>
+            <m:sty m:val="p"/>
+          </m:rPr>
+          <m:t>−</m:t>
+        </m:r>
+        <m:sSub>
+          <m:e>
+            <m:r>
+              <m:t>a</m:t>
+            </m:r>
+          </m:e>
+          <m:sub>
+            <m:r>
+              <m:t>2</m:t>
+            </m:r>
+          </m:sub>
+        </m:sSub>
+        <m:r>
+          <m:rPr>
+            <m:sty m:val="p"/>
+          </m:rPr>
+          <m:t>/</m:t>
+        </m:r>
+        <m:r>
+          <m:rPr>
+            <m:sty m:val="p"/>
+          </m:rPr>
+          <m:t>(</m:t>
+        </m:r>
+        <m:r>
+          <m:t>3</m:t>
+        </m:r>
+        <m:sSub>
+          <m:e>
+            <m:r>
+              <m:t>a</m:t>
+            </m:r>
+          </m:e>
+          <m:sub>
+            <m:r>
+              <m:t>3</m:t>
+            </m:r>
+          </m:sub>
+        </m:sSub>
+        <m:r>
+          <m:rPr>
+            <m:sty m:val="p"/>
+          </m:rPr>
+          <m:t>)</m:t>
+        </m:r>
+      </m:oMath>
+      <w:r>
+        <w:t xml:space="preserve"> es un pico válido si </w:t>
+      </w:r>
+      <m:oMath>
+        <m:sSub>
+          <m:e>
+            <m:r>
+              <m:t>a</m:t>
+            </m:r>
+          </m:e>
+          <m:sub>
+            <m:r>
+              <m:t>3</m:t>
+            </m:r>
+          </m:sub>
+        </m:sSub>
+        <m:r>
+          <m:rPr>
+            <m:sty m:val="p"/>
+          </m:rPr>
+          <m:t>&lt;</m:t>
+        </m:r>
+        <m:r>
+          <m:t>0</m:t>
+        </m:r>
+      </m:oMath>
+      <w:r>
+        <w:t xml:space="preserve"> y cae dentro de la ventana; el ritmo se obtiene evaluando </w:t>
+      </w:r>
+      <m:oMath>
+        <m:sSup>
+          <m:e>
+            <m:r>
+              <m:t>S</m:t>
+            </m:r>
+          </m:e>
+          <m:sup>
+            <m:r>
+              <m:rPr>
+                <m:sty m:val="p"/>
+              </m:rPr>
+              <m:t>′</m:t>
+            </m:r>
+          </m:sup>
+        </m:sSup>
+        <m:r>
+          <m:rPr>
+            <m:sty m:val="p"/>
+          </m:rPr>
+          <m:t>(</m:t>
+        </m:r>
+        <m:sSub>
+          <m:e>
+            <m:r>
+              <m:t>t</m:t>
+            </m:r>
+          </m:e>
+          <m:sub>
+            <m:r>
+              <m:t>p</m:t>
+            </m:r>
+            <m:r>
+              <m:t>i</m:t>
+            </m:r>
+            <m:r>
+              <m:t>c</m:t>
+            </m:r>
+            <m:r>
+              <m:t>o</m:t>
+            </m:r>
+          </m:sub>
+        </m:sSub>
+        <m:r>
+          <m:rPr>
+            <m:sty m:val="p"/>
+          </m:rPr>
+          <m:t>)</m:t>
+        </m:r>
+      </m:oMath>
+      <w:r>
+        <w:t xml:space="preserve"> con los coeficientes de la cúbica local.</w:t>
       </w:r>
     </w:p>
     <w:p>
@@ -34008,7 +34488,63 @@
           <w:sz w:val="20"/>
           <w:szCs w:val="20"/>
         </w:rPr>
-        <w:t>Tabla 11. Picos en semanas desde t = 0 y sensibilidad de la regresión cúbica local.</w:t>
+        <w:t xml:space="preserve">Tabla 11. Picos en semanas </w:t>
+      </w:r>
+      <w:r>
+        <w:rPr>
+          <w:i/>
+          <w:iCs/>
+          <w:sz w:val="20"/>
+          <w:szCs w:val="20"/>
+        </w:rPr>
+        <w:t xml:space="preserve">desde </w:t>
+      </w:r>
+      <m:oMath>
+        <m:r>
+          <w:rPr>
+            <w:rFonts w:ascii="Cambria Math" w:hAnsi="Cambria Math"/>
+            <w:sz w:val="20"/>
+            <w:szCs w:val="20"/>
+          </w:rPr>
+          <m:t>t</m:t>
+        </m:r>
+        <m:r>
+          <m:rPr>
+            <m:sty m:val="p"/>
+          </m:rPr>
+          <w:rPr>
+            <w:rFonts w:ascii="Cambria Math" w:hAnsi="Cambria Math"/>
+            <w:sz w:val="20"/>
+            <w:szCs w:val="20"/>
+          </w:rPr>
+          <m:t>=</m:t>
+        </m:r>
+        <m:r>
+          <w:rPr>
+            <w:rFonts w:ascii="Cambria Math" w:hAnsi="Cambria Math"/>
+            <w:sz w:val="20"/>
+            <w:szCs w:val="20"/>
+          </w:rPr>
+          <m:t>0</m:t>
+        </m:r>
+      </m:oMath>
+      <w:r>
+        <w:rPr>
+          <w:i/>
+          <w:iCs/>
+          <w:sz w:val="20"/>
+          <w:szCs w:val="20"/>
+        </w:rPr>
+        <w:t xml:space="preserve"> y</w:t>
+      </w:r>
+      <w:r>
+        <w:rPr>
+          <w:i/>
+          <w:iCs/>
+          <w:sz w:val="20"/>
+          <w:szCs w:val="20"/>
+        </w:rPr>
+        <w:t xml:space="preserve"> sensibilidad de la regresión cúbica local.</w:t>
       </w:r>
     </w:p>
     <w:tbl>
@@ -41457,7 +41993,48 @@
         <w:rPr>
           <w:b w:val="0"/>
         </w:rPr>
-        <w:t xml:space="preserve"> El método se generaliza a los tres casos al aplicar la misma cúbica localmente alrededor del pico medido, con la misma eliminación gaussiana. La herramienta valida su propio modelo al comprobar a &lt; 0 y que el pico quede dentro de la ventana, y muestra la sensibilidad al ancho elegido.</w:t>
+        <w:t xml:space="preserve"> El método se generaliza a los tres casos al aplicar la misma cúbica localmente alrededor del pico medido, con la misma eliminación gaussiana. La herramienta valida su propio modelo </w:t>
+      </w:r>
+      <w:r>
+        <w:rPr>
+          <w:b w:val="0"/>
+        </w:rPr>
+        <w:t xml:space="preserve">al comprobar </w:t>
+      </w:r>
+      <m:oMath>
+        <m:sSub>
+          <m:e>
+            <m:r>
+              <m:t>a</m:t>
+            </m:r>
+          </m:e>
+          <m:sub>
+            <m:r>
+              <m:t>3</m:t>
+            </m:r>
+          </m:sub>
+        </m:sSub>
+        <m:r>
+          <m:rPr>
+            <m:sty m:val="p"/>
+          </m:rPr>
+          <m:t>&lt;</m:t>
+        </m:r>
+        <m:r>
+          <m:t>0</m:t>
+        </m:r>
+      </m:oMath>
+      <w:r>
+        <w:rPr>
+          <w:b w:val="0"/>
+        </w:rPr>
+        <w:t xml:space="preserve"> y</w:t>
+      </w:r>
+      <w:r>
+        <w:rPr>
+          <w:b w:val="0"/>
+        </w:rPr>
+        <w:t xml:space="preserve"> que el pico quede dentro de la ventana, y muestra la sensibilidad al ancho elegido.</w:t>
       </w:r>
     </w:p>
     <w:p>

</xml_diff>

<commit_message>
Revisión del informe y gráficos con coma decimal
- Informe: apartado 3.7 Implementación (script y planilla, NumPy, Matplotlib y uso de IA),
  conclusión 5 con dificultades y aprendizajes, argumento de la trazadora corregido,
  costo de CDN sin afirmar de más y semanas 34, 35, 36 y 37 sin ambigüedad con la coma decimal
- Script: ejes y leyendas de los gráficos con coma decimal y fechas dd/mm/aaaa
- Presentación: gráficos regenerados y tarjeta de la trazadora alineada con el informe

Co-Authored-By: Claude Opus 5.5 <noreply@anthropic.com>
</commit_message>
<xml_diff>
--- a/ENTREGABLES/Informe_Proyecto_Metodos_Numericos_Rosa_Pastel.docx
+++ b/ENTREGABLES/Informe_Proyecto_Metodos_Numericos_Rosa_Pastel.docx
@@ -650,7 +650,7 @@
             <w:tab/>
           </w:r>
           <w:r>
-            <w:t>10</w:t>
+            <w:t>11</w:t>
           </w:r>
         </w:p>
         <w:p>
@@ -661,13 +661,30 @@
             </w:tabs>
           </w:pPr>
           <w:r>
-            <w:t xml:space="preserve">3.7. Limitaciones</w:t>
+            <w:t xml:space="preserve">3.7. Implementación</w:t>
           </w:r>
           <w:r>
             <w:tab/>
           </w:r>
           <w:r>
             <w:t>11</w:t>
+          </w:r>
+        </w:p>
+        <w:p>
+          <w:pPr>
+            <w:pStyle w:val="TOC2"/>
+            <w:tabs>
+              <w:tab w:val="right" w:leader="dot" w:pos="8844"/>
+            </w:tabs>
+          </w:pPr>
+          <w:r>
+            <w:t xml:space="preserve">3.8. Limitaciones</w:t>
+          </w:r>
+          <w:r>
+            <w:tab/>
+          </w:r>
+          <w:r>
+            <w:t>12</w:t>
           </w:r>
         </w:p>
         <w:p>
@@ -684,7 +701,7 @@
             <w:tab/>
           </w:r>
           <w:r>
-            <w:t>12</w:t>
+            <w:t>13</w:t>
           </w:r>
         </w:p>
         <w:p>
@@ -701,7 +718,7 @@
             <w:tab/>
           </w:r>
           <w:r>
-            <w:t>13</w:t>
+            <w:t>14</w:t>
           </w:r>
         </w:p>
         <w:p>
@@ -718,7 +735,7 @@
             <w:tab/>
           </w:r>
           <w:r>
-            <w:t>14</w:t>
+            <w:t>15</w:t>
           </w:r>
           <w:r>
             <w:fldChar w:fldCharType="end"/>
@@ -1451,7 +1468,7 @@
         <w:t xml:space="preserve">Trazadora cúbica</w:t>
       </w:r>
       <w:r>
-        <w:t xml:space="preserve"> (apartado 5.5): requiere plantear y resolver un sistema con todos los datos de la serie, cuando el cruce solo depende de las semanas cercanas a la meta.</w:t>
+        <w:t xml:space="preserve"> (apartado 5.5): está pensada para muchos puntos. En un tramo corto, la trazadora natural impone curvatura nula en sus extremos, una condición artificial para esta serie, y exige resolver un sistema de ecuaciones que la interpolación de Newton evita.</w:t>
       </w:r>
     </w:p>
     <w:p>
@@ -1500,50 +1517,7 @@
         <w:jc w:val="both"/>
       </w:pPr>
       <w:r>
-        <w:t xml:space="preserve">Se eligieron las semanas </w:t>
-      </w:r>
-      <m:oMath>
-        <m:r>
-          <m:t>t</m:t>
-        </m:r>
-        <m:r>
-          <m:rPr>
-            <m:sty m:val="p"/>
-          </m:rPr>
-          <m:t>=</m:t>
-        </m:r>
-        <m:r>
-          <m:t>34</m:t>
-        </m:r>
-        <m:r>
-          <m:rPr>
-            <m:sty m:val="p"/>
-          </m:rPr>
-          <m:t>,</m:t>
-        </m:r>
-        <m:r>
-          <m:t>35</m:t>
-        </m:r>
-        <m:r>
-          <m:rPr>
-            <m:sty m:val="p"/>
-          </m:rPr>
-          <m:t>,</m:t>
-        </m:r>
-        <m:r>
-          <m:t>36</m:t>
-        </m:r>
-      </m:oMath>
-      <w:r>
-        <w:t xml:space="preserve"> y </w:t>
-      </w:r>
-      <m:oMath>
-        <m:r>
-          <m:t>37</m:t>
-        </m:r>
-      </m:oMath>
-      <w:r>
-        <w:t xml:space="preserve"> porque rodean la meta. Cuatro puntos determinan un polinomio de grado 3 que pasa exactamente por ellos y sigue la curvatura cerca del cruce, como en el ejemplo resuelto del apartado 5.3. Con los 47 puntos el grado llegaría a 46 y aparecerían oscilaciones hacia los bordes del intervalo (Arnaudo, 2026, apartado 5.4). Las diferencias divididas se calculan con</w:t>
+        <w:t xml:space="preserve">Se eligieron las semanas 34, 35, 36 y 37 porque rodean la meta. Cuatro puntos determinan un polinomio de grado 3 que pasa exactamente por ellos y sigue la curvatura cerca del cruce, como en el ejemplo resuelto del apartado 5.3. Con los 47 puntos el grado llegaría a 46 y aparecerían oscilaciones hacia los bordes del intervalo (Arnaudo, 2026, apartado 5.4). Las diferencias divididas se calculan con</w:t>
       </w:r>
     </w:p>
     <w:p>
@@ -9574,7 +9548,7 @@
         </m:sSup>
       </m:oMath>
       <w:r>
-        <w:t xml:space="preserve"> calculado con los métodos numéricos indica cuándo el volumen servido de la canción en México alcanzó unos 372 TB, un dato útil para estimar los costos de distribución de contenido, que suelen facturarse por volumen.</w:t>
+        <w:t xml:space="preserve"> calculado con los métodos numéricos indica cuándo el volumen servido de la canción en México alcanzó unos 372 TB, un dato útil para estimar los costos de distribución de contenido, que en general dependen del volumen transferido.</w:t>
       </w:r>
     </w:p>
     <w:p>
@@ -10797,9 +10771,79 @@
       </w:pPr>
       <w:bookmarkStart w:name="_Toc17" w:id="17"/>
       <w:r>
-        <w:t xml:space="preserve">3.7. Limitaciones</w:t>
+        <w:t xml:space="preserve">3.7. Implementación</w:t>
       </w:r>
       <w:bookmarkEnd w:id="17"/>
+    </w:p>
+    <w:p>
+      <w:pPr>
+        <w:ind w:firstLine="720"/>
+        <w:jc w:val="both"/>
+      </w:pPr>
+      <w:r>
+        <w:t xml:space="preserve">Todo el procedimiento se programó en Python, con NumPy para los cálculos (Harris et al., 2020) y Matplotlib para los gráficos (Hunter, 2007). El archivo </w:t>
+      </w:r>
+      <w:r>
+        <w:rPr>
+          <w:rFonts w:ascii="Courier New" w:cs="Courier New" w:eastAsia="Courier New" w:hAnsi="Courier New"/>
+          <w:sz w:val="22"/>
+          <w:szCs w:val="22"/>
+        </w:rPr>
+        <w:t xml:space="preserve">analisis_resurgimiento_rosa_pastel.py</w:t>
+      </w:r>
+      <w:r>
+        <w:t xml:space="preserve">, que se entrega como material complementario junto con los datos en CSV, lee cada serie, arma la tabla de diferencias divididas, ejecuta los dos métodos de búsqueda de raíces, imprime las tablas de este informe y genera las figuras. Las funciones de interpolación, Bisección y Newton-Raphson se escribieron siguiendo los algoritmos de los apuntes, sin recurrir a funciones de resolución de bibliotecas.</w:t>
+      </w:r>
+    </w:p>
+    <w:p>
+      <w:pPr>
+        <w:ind w:firstLine="720"/>
+        <w:jc w:val="both"/>
+      </w:pPr>
+      <w:r>
+        <w:t xml:space="preserve">Como verificación independiente, los mismos cálculos se reprodujeron con fórmulas en la planilla </w:t>
+      </w:r>
+      <w:r>
+        <w:rPr>
+          <w:rFonts w:ascii="Courier New" w:cs="Courier New" w:eastAsia="Courier New" w:hAnsi="Courier New"/>
+          <w:sz w:val="22"/>
+          <w:szCs w:val="22"/>
+        </w:rPr>
+        <w:t xml:space="preserve">Modelo_Numerico_Rosa_Pastel_Belanova.xlsx</w:t>
+      </w:r>
+      <w:r>
+        <w:t xml:space="preserve">, que contiene los datos, la tabla de diferencias divididas y las iteraciones de ambos métodos, y que llega al mismo valor de </w:t>
+      </w:r>
+      <m:oMath>
+        <m:sSup>
+          <m:e>
+            <m:r>
+              <m:t>t</m:t>
+            </m:r>
+          </m:e>
+          <m:sup>
+            <m:r>
+              <m:rPr>
+                <m:sty m:val="p"/>
+              </m:rPr>
+              <m:t>*</m:t>
+            </m:r>
+          </m:sup>
+        </m:sSup>
+      </m:oMath>
+      <w:r>
+        <w:t xml:space="preserve">. Como asistencia para programar, generar los gráficos y redactar se utilizaron herramientas de inteligencia artificial generativa (Anthropic, 2026; Google, 2026); los integrantes del grupo verificaron los datos, los cálculos y las conclusiones.</w:t>
+      </w:r>
+    </w:p>
+    <w:p>
+      <w:pPr>
+        <w:pStyle w:val="Heading2"/>
+      </w:pPr>
+      <w:bookmarkStart w:name="_Toc18" w:id="18"/>
+      <w:r>
+        <w:t xml:space="preserve">3.8. Limitaciones</w:t>
+      </w:r>
+      <w:bookmarkEnd w:id="18"/>
     </w:p>
     <w:p>
       <w:pPr>
@@ -10890,11 +10934,11 @@
         <w:pStyle w:val="Heading1"/>
         <w:pageBreakBefore/>
       </w:pPr>
-      <w:bookmarkStart w:name="_Toc18" w:id="18"/>
+      <w:bookmarkStart w:name="_Toc19" w:id="19"/>
       <w:r>
         <w:t xml:space="preserve">4. Conclusiones</w:t>
       </w:r>
-      <w:bookmarkEnd w:id="18"/>
+      <w:bookmarkEnd w:id="19"/>
     </w:p>
     <w:p>
       <w:pPr>
@@ -11087,11 +11131,23 @@
     </w:p>
     <w:p>
       <w:pPr>
-        <w:ind w:firstLine="720"/>
+        <w:pStyle w:val="ListParagraph"/>
+        <w:numPr>
+          <w:ilvl w:val="0"/>
+          <w:numId w:val="4"/>
+        </w:numPr>
+        <w:spacing w:after="100"/>
         <w:jc w:val="both"/>
       </w:pPr>
       <w:r>
-        <w:t xml:space="preserve">El programa se implementó en Python, con NumPy para los cálculos (Harris et al., 2020) y Matplotlib para los gráficos (Hunter, 2007), y sus resultados se verificaron con una planilla de cálculo. Como asistencia para programar, generar los gráficos y redactar se utilizaron herramientas de inteligencia artificial generativa (Anthropic, 2026; Google, 2026); los integrantes del grupo verificaron los datos, los cálculos y las conclusiones.</w:t>
+        <w:rPr>
+          <w:b/>
+          <w:bCs/>
+        </w:rPr>
+        <w:t xml:space="preserve">Dificultades y aprendizajes.</w:t>
+      </w:r>
+      <w:r>
+        <w:t xml:space="preserve"> La principal dificultad fue elegir un modelo que respondiera la pregunta con los métodos vistos en la materia: una regresión polinómica sobre toda la serie se descartó porque no forma parte del programa y no pasa por los datos medidos. El trabajo mostró que la elección de los datos y del modelo influye en el resultado más que el método de búsqueda de raíces, que cuatro mediciones bien elegidas alcanzan para estimar el cruce, y que conviene contrastar cada resultado con un cálculo independiente, como la interpolación lineal y la planilla de cálculo.</w:t>
       </w:r>
     </w:p>
     <w:p>
@@ -11099,11 +11155,11 @@
         <w:pStyle w:val="Heading1"/>
         <w:pageBreakBefore/>
       </w:pPr>
-      <w:bookmarkStart w:name="_Toc19" w:id="19"/>
+      <w:bookmarkStart w:name="_Toc20" w:id="20"/>
       <w:r>
         <w:t xml:space="preserve">5. Bibliografía</w:t>
       </w:r>
-      <w:bookmarkEnd w:id="19"/>
+      <w:bookmarkEnd w:id="20"/>
     </w:p>
     <w:p>
       <w:pPr>
@@ -11327,11 +11383,11 @@
         <w:pStyle w:val="Heading1"/>
         <w:pageBreakBefore/>
       </w:pPr>
-      <w:bookmarkStart w:name="_Toc20" w:id="20"/>
+      <w:bookmarkStart w:name="_Toc21" w:id="21"/>
       <w:r>
         <w:t xml:space="preserve">Anexo A. Datos completos de «Rosa Pastel»</w:t>
       </w:r>
-      <w:bookmarkEnd w:id="20"/>
+      <w:bookmarkEnd w:id="21"/>
     </w:p>
     <w:p>
       <w:pPr>

</xml_diff>

<commit_message>
Usar solo el vocabulario de los apuntes: sin Bolzano, Cardano, semilla ni convergencia lineal/cuadrática
Co-Authored-By: Claude Opus 5.5 <noreply@anthropic.com>
</commit_message>
<xml_diff>
--- a/ENTREGABLES/Informe_Proyecto_Metodos_Numericos_Rosa_Pastel.docx
+++ b/ENTREGABLES/Informe_Proyecto_Metodos_Numericos_Rosa_Pastel.docx
@@ -1498,7 +1498,7 @@
         <w:jc w:val="both"/>
       </w:pPr>
       <w:r>
-        <w:t xml:space="preserve">Para resolver la ecuación se compararon un método cerrado y uno abierto. La Bisección garantiza la convergencia cuando hay cambio de signo; Newton-Raphson converge más rápido y se puede aplicar porque la derivada del polinomio se obtiene de forma analítica. Por eso no fue necesario recurrir al método de la secante (apartado 3.5), pensado para cuando la derivada es difícil de obtener.</w:t>
+        <w:t>Para resolver la ecuación se compararon un método que trabaja sobre un intervalo con cambio de signo (Bisección) y un método abierto (Newton-Raphson). La Bisección garantiza la convergencia cuando hay cambio de signo; Newton-Raphson converge más rápido y se puede aplicar porque la derivada del polinomio se obtiene de forma analítica. Por eso no fue necesario recurrir al método de la secante (apartado 3.5), pensado para cuando la derivada es difícil de obtener.</w:t>
       </w:r>
     </w:p>
     <w:p>
@@ -3285,7 +3285,7 @@
         </m:r>
       </m:oMath>
       <w:r>
-        <w:t xml:space="preserve">. Es una ecuación de grado 3: la fórmula de Cardano permite resolverla, pero es engorrosa, mientras que los métodos iterativos de la materia la resuelven con un error controlado. En el intervalo </w:t>
+        <w:t xml:space="preserve">. Es una ecuación de grado 3: despejar t es engorroso, mientras que los métodos iterativos de la materia la resuelven con un error controlado. En el intervalo </w:t>
       </w:r>
       <m:oMath>
         <m:r>
@@ -8437,7 +8437,7 @@
                 <w:sz w:val="20"/>
                 <w:szCs w:val="20"/>
               </w:rPr>
-              <w:t xml:space="preserve">Cerrado</w:t>
+              <w:t>De intervalo</w:t>
             </w:r>
           </w:p>
         </w:tc>
@@ -8811,7 +8811,7 @@
                 <w:sz w:val="20"/>
                 <w:szCs w:val="20"/>
               </w:rPr>
-              <w:t xml:space="preserve">Lineal</w:t>
+              <w:t>Lenta</w:t>
             </w:r>
           </w:p>
         </w:tc>
@@ -8842,7 +8842,7 @@
                 <w:sz w:val="20"/>
                 <w:szCs w:val="20"/>
               </w:rPr>
-              <w:t xml:space="preserve">Cuadrática cerca de una raíz simple</w:t>
+              <w:t>Rápida (alto grado de convergencia)</w:t>
             </w:r>
           </w:p>
         </w:tc>
@@ -9180,7 +9180,7 @@
         <w:jc w:val="both"/>
       </w:pPr>
       <w:r>
-        <w:t xml:space="preserve">La Figura 2 muestra la evolución del error aproximado. La Bisección desciende de forma aproximadamente lineal en escala logarítmica, porque el intervalo se divide por dos en cada paso; Newton-Raphson cae mucho más rápido, porque parte cerca de la raíz y la pendiente no se anula. Esa rapidez no garantiza la convergencia para cualquier función o valor inicial.</w:t>
+        <w:t>La Figura 2 muestra la evolución del error aproximado. La Bisección baja de a poco (en línea recta en escala logarítmica), porque el intervalo se divide por dos en cada paso; Newton-Raphson cae mucho más rápido, porque parte cerca de la raíz y la pendiente no se anula. Esa rapidez no garantiza la convergencia para cualquier función o valor inicial.</w:t>
       </w:r>
     </w:p>
     <w:p>

</xml_diff>

<commit_message>
Informe y presentación: sacar la trazadora y las referencias a apartados de los apuntes
Co-Authored-By: Claude Opus 5.5 <noreply@anthropic.com>
</commit_message>
<xml_diff>
--- a/ENTREGABLES/Informe_Proyecto_Metodos_Numericos_Rosa_Pastel.docx
+++ b/ENTREGABLES/Informe_Proyecto_Metodos_Numericos_Rosa_Pastel.docx
@@ -846,7 +846,7 @@
         <w:jc w:val="both"/>
       </w:pPr>
       <w:r>
-        <w:t xml:space="preserve">Se trabajó con dos temas de los apuntes de la cátedra (Arnaudo, 2026): la interpolación polinomial de Newton mediante diferencias divididas (apartado 5.3) y la búsqueda de raíces mediante los métodos de Bisección (apartado 3.2) y de Newton-Raphson (apartado 3.4). El primero construye el polinomio </w:t>
+        <w:t xml:space="preserve">Se trabajó con dos temas de los apuntes de la cátedra (Arnaudo, 2026): la interpolación polinomial de Newton mediante diferencias divididas y la búsqueda de raíces mediante los métodos de Bisección y de Newton-Raphson. El primero construye el polinomio </w:t>
       </w:r>
       <m:oMath>
         <m:r>
@@ -1115,7 +1115,7 @@
         <w:jc w:val="both"/>
       </w:pPr>
       <w:r>
-        <w:t xml:space="preserve">Para los dos métodos de búsqueda de raíces se utilizó el error relativo porcentual aproximado (Arnaudo, 2026, cap. 2) y el cálculo se detuvo cuando </w:t>
+        <w:t xml:space="preserve">Para los dos métodos de búsqueda de raíces se utilizó el error relativo porcentual aproximado (Arnaudo, 2026) y el cálculo se detuvo cuando </w:t>
       </w:r>
       <m:oMath>
         <m:r>
@@ -1447,28 +1447,7 @@
         <w:t xml:space="preserve">Polinomio de Lagrange</w:t>
       </w:r>
       <w:r>
-        <w:t xml:space="preserve"> (apartado 5.4): con los mismos cuatro puntos da exactamente el mismo polinomio, pero no ofrece la tabla de diferencias divididas que permite agregar puntos sin rehacer el cálculo.</w:t>
-      </w:r>
-    </w:p>
-    <w:p>
-      <w:pPr>
-        <w:pStyle w:val="ListParagraph"/>
-        <w:numPr>
-          <w:ilvl w:val="0"/>
-          <w:numId w:val="2"/>
-        </w:numPr>
-        <w:spacing w:after="100"/>
-        <w:jc w:val="both"/>
-      </w:pPr>
-      <w:r>
-        <w:rPr>
-          <w:b/>
-          <w:bCs/>
-        </w:rPr>
-        <w:t xml:space="preserve">Trazadora cúbica</w:t>
-      </w:r>
-      <w:r>
-        <w:t xml:space="preserve"> (apartado 5.5): está pensada para muchos puntos. En un tramo corto, la trazadora natural impone curvatura nula en sus extremos, una condición artificial para esta serie, y exige resolver un sistema de ecuaciones que la interpolación de Newton evita.</w:t>
+        <w:t xml:space="preserve">: con los mismos cuatro puntos da exactamente el mismo polinomio, pero no ofrece la tabla de diferencias divididas que permite agregar puntos sin rehacer el cálculo.</w:t>
       </w:r>
     </w:p>
     <w:p>
@@ -1489,7 +1468,7 @@
         <w:t xml:space="preserve">Regresión por mínimos cuadrados</w:t>
       </w:r>
       <w:r>
-        <w:t xml:space="preserve"> (apartado 5.2): el apunte desarrolla la recta y los modelos linealizables, que no pasan por los datos ni representan la forma de la serie acumulada.</w:t>
+        <w:t xml:space="preserve">: el apunte desarrolla la recta y los modelos linealizables, que no pasan por los datos ni representan la forma de la serie acumulada.</w:t>
       </w:r>
     </w:p>
     <w:p>
@@ -1498,7 +1477,7 @@
         <w:jc w:val="both"/>
       </w:pPr>
       <w:r>
-        <w:t>Para resolver la ecuación se compararon un método que trabaja sobre un intervalo con cambio de signo (Bisección) y un método abierto (Newton-Raphson). La Bisección garantiza la convergencia cuando hay cambio de signo; Newton-Raphson converge más rápido y se puede aplicar porque la derivada del polinomio se obtiene de forma analítica. Por eso no fue necesario recurrir al método de la secante (apartado 3.5), pensado para cuando la derivada es difícil de obtener.</w:t>
+        <w:t>Para resolver la ecuación se compararon un método que trabaja sobre un intervalo con cambio de signo (Bisección) y un método abierto (Newton-Raphson). La Bisección garantiza la convergencia cuando hay cambio de signo; Newton-Raphson converge más rápido y se puede aplicar porque la derivada del polinomio se obtiene de forma analítica. Por eso no fue necesario recurrir al método de la secante, pensado para cuando la derivada es difícil de obtener.</w:t>
       </w:r>
     </w:p>
     <w:p>
@@ -1517,7 +1496,7 @@
         <w:jc w:val="both"/>
       </w:pPr>
       <w:r>
-        <w:t xml:space="preserve">Se eligieron las semanas 34, 35, 36 y 37 porque rodean la meta. Cuatro puntos determinan un polinomio de grado 3 que pasa exactamente por ellos y sigue la curvatura cerca del cruce, como en el ejemplo resuelto del apartado 5.3. Con los 47 puntos el grado llegaría a 46 y aparecerían oscilaciones hacia los bordes del intervalo (Arnaudo, 2026, apartado 5.4). Las diferencias divididas se calculan con</w:t>
+        <w:t xml:space="preserve">Se eligieron las semanas 34, 35, 36 y 37 porque rodean la meta. Cuatro puntos determinan un polinomio de grado 3 que pasa exactamente por ellos y sigue la curvatura cerca del cruce, como en el ejemplo resuelto del apunte. Con los 47 puntos el grado llegaría a 46 y aparecerían oscilaciones hacia los bordes del intervalo (Arnaudo, 2026). Las diferencias divididas se calculan con</w:t>
       </w:r>
     </w:p>
     <w:p>

</xml_diff>

<commit_message>
Cátedra y comisión G en carátula, portada, README, script y guía
Co-Authored-By: Claude Opus 5.5 <noreply@anthropic.com>
</commit_message>
<xml_diff>
--- a/ENTREGABLES/Informe_Proyecto_Metodos_Numericos_Rosa_Pastel.docx
+++ b/ENTREGABLES/Informe_Proyecto_Metodos_Numericos_Rosa_Pastel.docx
@@ -287,14 +287,14 @@
                 <w:sz w:val="28"/>
                 <w:szCs w:val="28"/>
               </w:rPr>
-              <w:t xml:space="preserve">Comisión</w:t>
+              <w:t xml:space="preserve">Cátedra y comisión</w:t>
             </w:r>
             <w:r>
               <w:rPr>
                 <w:sz w:val="28"/>
                 <w:szCs w:val="28"/>
               </w:rPr>
-              <w:t xml:space="preserve">: 46324 · Cátedra G</w:t>
+              <w:t xml:space="preserve">: G</w:t>
             </w:r>
           </w:p>
           <w:p>

</xml_diff>